<commit_message>
chore: push de avances P8-Data-Analyst (fase 1/2)
Push inicial con trabajo consolidado del proyecto. Los documentos
de trazabilidad de prompts (GitPush.*.docx) se diferirán al siguiente
push, renombrados a parte1.de3 / parte2.de3 / parte3.de3 para incluir
también el registro de la sesión actual.

Incluye:
- .gitignore: repara línea corrupta, añade *.old.* y *lista*
- Documentación nueva: catálogo de datasets (PDFs + fuentes .md/.docx),
  prompts de dashboards (Google/Gemini/Looker Studio), transferencia
  de laboratorio, especificaciones ipynb a documento
- Notebooks: 00_homogenizacion y 01_eda movidos a archive/
  (convención interna: recuperables, liberan espacio para nuevos outputs)
- Nuevos notebooks de comparación CSV/XLSX (ipynb + raw)
- scripts_py/tree_fromfile.py: utilidad para visualizar árboles a partir
  de listas de archivos, resuelve nombres por búsqueda recursiva si no
  son rutas completas

Refs: Issue #2 (Data Viz Expert)
</commit_message>
<xml_diff>
--- a/docs/promts/NuevaPlantilla.TC.20260414094719M.docx
+++ b/docs/promts/NuevaPlantilla.TC.20260414094719M.docx
@@ -262,7 +262,7 @@
               <w:sz w:val="16"/>
               <w:szCs w:val="16"/>
             </w:rPr>
-            <w:t>20260414094600</w:t>
+            <w:t>00000000000000</w:t>
           </w:r>
           <w:r>
             <w:rPr>
@@ -1737,6 +1737,29 @@
       <w:spacing w:after="0" w:line="240" w:lineRule="auto"/>
     </w:pPr>
   </w:style>
+  <w:style w:type="character" w:styleId="Hipervnculo">
+    <w:name w:val="Hyperlink"/>
+    <w:basedOn w:val="Fuentedeprrafopredeter"/>
+    <w:uiPriority w:val="99"/>
+    <w:unhideWhenUsed/>
+    <w:rsid w:val="005D0593"/>
+    <w:rPr>
+      <w:color w:val="467886" w:themeColor="hyperlink"/>
+      <w:u w:val="single"/>
+    </w:rPr>
+  </w:style>
+  <w:style w:type="character" w:styleId="Mencinsinresolver">
+    <w:name w:val="Unresolved Mention"/>
+    <w:basedOn w:val="Fuentedeprrafopredeter"/>
+    <w:uiPriority w:val="99"/>
+    <w:semiHidden/>
+    <w:unhideWhenUsed/>
+    <w:rsid w:val="005D0593"/>
+    <w:rPr>
+      <w:color w:val="605E5C"/>
+      <w:shd w:val="clear" w:color="auto" w:fill="E1DFDD"/>
+    </w:rPr>
+  </w:style>
 </w:styles>
 </file>
 

</xml_diff>